<commit_message>
Thesis v3: apply verified references [6][7][8], soften Sato claim
Co-Authored-By: Claude Opus 5.5 (1M context) <noreply@anthropic.com>
</commit_message>
<xml_diff>
--- a/results/thesis_v3.docx
+++ b/results/thesis_v3.docx
@@ -4235,7 +4235,7 @@
           <w:sz w:val="20"/>
           <w:szCs w:val="20"/>
         </w:rPr>
-        <w:t xml:space="preserve">以上の結果は、CE損失で学習したSEが、学習に用いた認識器に向けて入力を調整する「波形領域のアダプタ」として働くことを示唆する。その効果はWhisper系列内には持ち越されるが、系列外の認識器では失われ、むしろ悪化する。一方、気導音声の表現に近づけるEnc L1は認識器を選ばない代わりに改善も小さい。ASR損失によるSEの学習には、対象の認識器への特化と汎用性のトレードオフが存在する。自己教師あり表現の損失で学習したSEは損失計算に用いていないモデルにも汎化するという報告[8]と合わせると、汎化の範囲は損失の種類によって決まると考えられる。</w:t>
+        <w:t xml:space="preserve">以上の結果は、CE損失で学習したSEが、学習に用いた認識器に向けて入力を調整する「波形領域のアダプタ」として働くことを示唆する。その効果はWhisper系列内には持ち越されるが、系列外の認識器では失われ、むしろ悪化する。一方、気導音声の表現に近づけるEnc L1は認識器を選ばない代わりに改善も小さい。ASR損失によるSEの学習には、対象の認識器への特化と汎用性のトレードオフが存在する。自己教師あり表現空間の距離を損失として学習したSEが複数の下流タスクで有効であるという報告[8]と合わせると、汎化の範囲は損失の種類に依存すると考えられる。</w:t>
       </w:r>
     </w:p>
     <w:p>
@@ -4402,7 +4402,7 @@
           <w:sz w:val="17"/>
           <w:szCs w:val="17"/>
         </w:rPr>
-        <w:t xml:space="preserve">[6] Y. Dissen, S. Yonash, I. Cohen, and J. Keshet, “Enhanced ASR Robustness to Packet Loss with a Front-End Adaptation Network,” Proc. Interspeech, 2024.【要確認】</w:t>
+        <w:t xml:space="preserve">[6] Y. Dissen, S. Yonash, I. Cohen, and J. Keshet, “Enhanced ASR Robustness to Packet Loss with a Front-End Adaptation Network,” Proc. Interspeech, 2024.</w:t>
       </w:r>
     </w:p>
     <w:p>
@@ -4415,7 +4415,7 @@
           <w:sz w:val="17"/>
           <w:szCs w:val="17"/>
         </w:rPr>
-        <w:t xml:space="preserve">[7] K. Iwamoto, T. Ochiai, M. Delcroix, et al., “How Does End-to-End Speech Recognition Training Impact Speech Enhancement Artifacts?” Proc. ICASSP, 2024.</w:t>
+        <w:t xml:space="preserve">[7] K. Iwamoto, T. Ochiai, M. Delcroix, et al., “How Does End-to-End Speech Recognition Training Impact Speech Enhancement Artifacts?” Proc. ICASSP, pp. 11031–11035, 2024.</w:t>
       </w:r>
     </w:p>
     <w:p>
@@ -4428,7 +4428,7 @@
           <w:sz w:val="17"/>
           <w:szCs w:val="17"/>
         </w:rPr>
-        <w:t xml:space="preserve">[8] H. Sato, T. Ochiai, M. Delcroix, et al., arXiv:2507.07631, 2025.【要確認：題目・掲載誌】</w:t>
+        <w:t xml:space="preserve">[8] H. Sato, T. Ochiai, M. Delcroix, et al., “Generic Speech Enhancement with Self-Supervised Representation Space Loss,” Frontiers in Signal Processing, vol. 5, 1587969, 2025.</w:t>
       </w:r>
     </w:p>
     <w:p>

</xml_diff>

<commit_message>
Thesis v3: cite de Oliveira et al. 2026 on ASR choice/text normalization in SE evaluation
Co-Authored-By: Claude Opus 5.5 (1M context) <noreply@anthropic.com>
</commit_message>
<xml_diff>
--- a/results/thesis_v3.docx
+++ b/results/thesis_v3.docx
@@ -4248,7 +4248,7 @@
           <w:sz w:val="20"/>
           <w:szCs w:val="20"/>
         </w:rPr>
-        <w:t xml:space="preserve">また、未正規化のCERでは句読点出力の抑制が改善として計上された。ASR損失で学習したSEの評価では、テキストの正規化と、学習に用いていない系列の認識器による評価が必要である。</w:t>
+        <w:t xml:space="preserve">また、未正規化のCERでは句読点出力の抑制が改善として計上された。de Oliveiraら[12]も、ASRによるSEの評価結果が認識器の選択とテキスト正規化の方法に大きく依存することを指摘している。ASR損失で学習したSEの評価では、テキストの正規化と、学習に用いていない系列の認識器による評価が特に重要である。</w:t>
       </w:r>
     </w:p>
     <w:p>
@@ -4468,6 +4468,19 @@
           <w:szCs w:val="17"/>
         </w:rPr>
         <w:t xml:space="preserve">[11] A. Radford, et al., “Robust Speech Recognition via Large-Scale Weak Supervision,” Proc. ICML, 2023.</w:t>
+      </w:r>
+    </w:p>
+    <w:p>
+      <w:pPr>
+        <w:spacing w:after="20" w:line="260"/>
+      </w:pPr>
+      <w:r>
+        <w:rPr>
+          <w:rFonts w:ascii="MS Mincho" w:cs="MS Mincho" w:eastAsia="MS Mincho" w:hAnsi="MS Mincho"/>
+          <w:sz w:val="17"/>
+          <w:szCs w:val="17"/>
+        </w:rPr>
+        <w:t xml:space="preserve">[12] D. de Oliveira, T. Peer, and T. Gerkmann, “Too Good to Be True: A Study on Modern Automatic Speech Recognition for the Evaluation of Speech Enhancement,” arXiv:2605.12107, 2026.</w:t>
       </w:r>
     </w:p>
     <w:sectPr>

</xml_diff>

<commit_message>
Thesis v3: fill all tables/text with confirmed normalized results (scripts 62-64); revise comb and FT claims
Co-Authored-By: Claude Opus 5.5 (1M context) <noreply@anthropic.com>
</commit_message>
<xml_diff>
--- a/results/thesis_v3.docx
+++ b/results/thesis_v3.docx
@@ -120,26 +120,7 @@
           <w:sz w:val="20"/>
           <w:szCs w:val="20"/>
         </w:rPr>
-        <w:t xml:space="preserve">(1) 学習に用いたWhisper-smallでは、句読点を正規化した評価でもCERが改善することを示す（</w:t>
-      </w:r>
-      <w:r>
-        <w:rPr>
-          <w:rFonts w:ascii="MS Mincho" w:cs="MS Mincho" w:eastAsia="MS Mincho" w:hAnsi="MS Mincho"/>
-          <w:b/>
-          <w:bCs/>
-          <w:color w:val="C00000"/>
-          <w:sz w:val="20"/>
-          <w:szCs w:val="20"/>
-        </w:rPr>
-        <w:t xml:space="preserve">【64待ち】</w:t>
-      </w:r>
-      <w:r>
-        <w:rPr>
-          <w:rFonts w:ascii="MS Mincho" w:cs="MS Mincho" w:eastAsia="MS Mincho" w:hAnsi="MS Mincho"/>
-          <w:sz w:val="20"/>
-          <w:szCs w:val="20"/>
-        </w:rPr>
-        <w:t xml:space="preserve">）。</w:t>
+        <w:t xml:space="preserve">(1) 学習に用いたWhisper-smallでは、句読点を正規化した評価でもCERがTAPS SE比で15.0%低下し、10話者全員で改善することを示す。</w:t>
       </w:r>
     </w:p>
     <w:p>
@@ -152,7 +133,7 @@
           <w:sz w:val="20"/>
           <w:szCs w:val="20"/>
         </w:rPr>
-        <w:t xml:space="preserve">(2) その改善はWhisper系列内には持ち越されるが、CTC系の認識器（MMS、XLS-R）ではむしろ悪化することを示す。</w:t>
+        <w:t xml:space="preserve">(2) その改善はWhisper-mediumには持ち越されるが、baseでは有意でなく、CTC系のXLS-Rではむしろ25.8%悪化することを示す。</w:t>
       </w:r>
     </w:p>
     <w:p>
@@ -647,7 +628,7 @@
           <w:sz w:val="20"/>
           <w:szCs w:val="20"/>
         </w:rPr>
-        <w:t xml:space="preserve">学習に用いたWhisper-smallに加え、Whisper系列内の汎化としてWhisper-base・medium、および喉マイク音声でファインチューニングしたWhisper-small（FT Whisper）を用いた。系列外の汎化として、CTC型のMMS-1B[9]（韓国語アダプタ）とXLS-R[10]を韓国語で追加学習したモデル（kresnik/wav2vec2-large-xlsr-korean）を用いた。Whisper系列はfaster-whisper（beam size 5）、CTC系はgreedy復号で認識した。</w:t>
+        <w:t xml:space="preserve">学習に用いたWhisper-smallに加え、Whisper系列内の汎化としてWhisper-base・medium、および喉マイク音声でファインチューニングしたWhisper-small（FT Whisper、dev CERが最良のエポックを採用）を用いた。系列外の汎化として、CTC型のMMS-1B[9]（韓国語アダプタ）とXLS-R[10]を韓国語で追加学習したモデル（kresnik/wav2vec2-large-xlsr-korean）を用いた。Whisper系列はfaster-whisper（beam size 5）、CTC系はgreedy復号で認識した。</w:t>
       </w:r>
     </w:p>
     <w:p>
@@ -751,83 +732,128 @@
           <w:sz w:val="20"/>
           <w:szCs w:val="20"/>
         </w:rPr>
-        <w:t xml:space="preserve">ごとのCERを示す。</w:t>
-      </w:r>
-      <w:r>
-        <w:rPr>
-          <w:rFonts w:ascii="MS Mincho" w:cs="MS Mincho" w:eastAsia="MS Mincho" w:hAnsi="MS Mincho"/>
-          <w:b/>
-          <w:bCs/>
-          <w:color w:val="C00000"/>
-          <w:sz w:val="20"/>
-          <w:szCs w:val="20"/>
-        </w:rPr>
-        <w:t xml:space="preserve">【64待ち：devで選ばれたλ、test CER、TAPS比、話者単位p値・改善話者数】</w:t>
-      </w:r>
-      <w:r>
-        <w:rPr>
-          <w:rFonts w:ascii="MS Mincho" w:cs="MS Mincho" w:eastAsia="MS Mincho" w:hAnsi="MS Mincho"/>
-          <w:sz w:val="20"/>
-          <w:szCs w:val="20"/>
-        </w:rPr>
-        <w:t xml:space="preserve"> 未正規化のCERでは改善幅が大きく見えるが、文末に句読点が付く発話の割合はTAPS SEの</w:t>
-      </w:r>
-      <w:r>
-        <w:rPr>
-          <w:rFonts w:ascii="MS Mincho" w:cs="MS Mincho" w:eastAsia="MS Mincho" w:hAnsi="MS Mincho"/>
-          <w:b/>
-          <w:bCs/>
-          <w:color w:val="C00000"/>
-          <w:sz w:val="20"/>
-          <w:szCs w:val="20"/>
-        </w:rPr>
-        <w:t xml:space="preserve">【64待ち：約91%】</w:t>
-      </w:r>
-      <w:r>
-        <w:rPr>
-          <w:rFonts w:ascii="MS Mincho" w:cs="MS Mincho" w:eastAsia="MS Mincho" w:hAnsi="MS Mincho"/>
-          <w:sz w:val="20"/>
-          <w:szCs w:val="20"/>
-        </w:rPr>
-        <w:t xml:space="preserve">に対し提案手法では</w:t>
-      </w:r>
-      <w:r>
-        <w:rPr>
-          <w:rFonts w:ascii="MS Mincho" w:cs="MS Mincho" w:eastAsia="MS Mincho" w:hAnsi="MS Mincho"/>
-          <w:b/>
-          <w:bCs/>
-          <w:color w:val="C00000"/>
-          <w:sz w:val="20"/>
-          <w:szCs w:val="20"/>
-        </w:rPr>
-        <w:t xml:space="preserve">【64待ち：0%】</w:t>
-      </w:r>
-      <w:r>
-        <w:rPr>
-          <w:rFonts w:ascii="MS Mincho" w:cs="MS Mincho" w:eastAsia="MS Mincho" w:hAnsi="MS Mincho"/>
-          <w:sz w:val="20"/>
-          <w:szCs w:val="20"/>
-        </w:rPr>
-        <w:t xml:space="preserve">であった。提案手法はWhisperが句読点を出力しないようにSE出力を変化させており、未正規化の改善幅のうち</w:t>
-      </w:r>
-      <w:r>
-        <w:rPr>
-          <w:rFonts w:ascii="MS Mincho" w:cs="MS Mincho" w:eastAsia="MS Mincho" w:hAnsi="MS Mincho"/>
-          <w:b/>
-          <w:bCs/>
-          <w:color w:val="C00000"/>
-          <w:sz w:val="20"/>
-          <w:szCs w:val="20"/>
-        </w:rPr>
-        <w:t xml:space="preserve">【64待ち：約4割】</w:t>
-      </w:r>
-      <w:r>
-        <w:rPr>
-          <w:rFonts w:ascii="MS Mincho" w:cs="MS Mincho" w:eastAsia="MS Mincho" w:hAnsi="MS Mincho"/>
-          <w:sz w:val="20"/>
-          <w:szCs w:val="20"/>
-        </w:rPr>
-        <w:t xml:space="preserve">はこの効果による。</w:t>
+        <w:t xml:space="preserve">ごとのCERを示す。devのCERは</w:t>
+      </w:r>
+      <w:r>
+        <w:rPr>
+          <w:rFonts w:ascii="Cambria Math" w:cs="Cambria Math" w:eastAsia="Cambria Math" w:hAnsi="Cambria Math"/>
+          <w:i/>
+          <w:iCs/>
+          <w:sz w:val="20"/>
+          <w:szCs w:val="20"/>
+        </w:rPr>
+        <w:t xml:space="preserve">λ</w:t>
+      </w:r>
+      <w:r>
+        <w:rPr>
+          <w:rFonts w:ascii="MS Mincho" w:cs="MS Mincho" w:eastAsia="MS Mincho" w:hAnsi="MS Mincho"/>
+          <w:sz w:val="20"/>
+          <w:szCs w:val="20"/>
+        </w:rPr>
+        <w:t xml:space="preserve"> = 10で最小（0.227）となったが、</w:t>
+      </w:r>
+      <w:r>
+        <w:rPr>
+          <w:rFonts w:ascii="Cambria Math" w:cs="Cambria Math" w:eastAsia="Cambria Math" w:hAnsi="Cambria Math"/>
+          <w:i/>
+          <w:iCs/>
+          <w:sz w:val="20"/>
+          <w:szCs w:val="20"/>
+        </w:rPr>
+        <w:t xml:space="preserve">λ</w:t>
+      </w:r>
+      <w:r>
+        <w:rPr>
+          <w:rFonts w:ascii="MS Mincho" w:cs="MS Mincho" w:eastAsia="MS Mincho" w:hAnsi="MS Mincho"/>
+          <w:sz w:val="20"/>
+          <w:szCs w:val="20"/>
+        </w:rPr>
+        <w:t xml:space="preserve"> = 2〜10ではほぼ横ばいであった（0.231・0.232・0.227）。選択した</w:t>
+      </w:r>
+      <w:r>
+        <w:rPr>
+          <w:rFonts w:ascii="Cambria Math" w:cs="Cambria Math" w:eastAsia="Cambria Math" w:hAnsi="Cambria Math"/>
+          <w:i/>
+          <w:iCs/>
+          <w:sz w:val="20"/>
+          <w:szCs w:val="20"/>
+        </w:rPr>
+        <w:t xml:space="preserve">λ</w:t>
+      </w:r>
+      <w:r>
+        <w:rPr>
+          <w:rFonts w:ascii="MS Mincho" w:cs="MS Mincho" w:eastAsia="MS Mincho" w:hAnsi="MS Mincho"/>
+          <w:sz w:val="20"/>
+          <w:szCs w:val="20"/>
+        </w:rPr>
+        <w:t xml:space="preserve"> = 10のtest CERは0.196であり、TAPS SE（0.230）から15.0%低下した。10話者全員でCERが低下し、話者単位の検定でも有意であった（</w:t>
+      </w:r>
+      <w:r>
+        <w:rPr>
+          <w:rFonts w:ascii="Cambria Math" w:cs="Cambria Math" w:eastAsia="Cambria Math" w:hAnsi="Cambria Math"/>
+          <w:i/>
+          <w:iCs/>
+          <w:sz w:val="20"/>
+          <w:szCs w:val="20"/>
+        </w:rPr>
+        <w:t xml:space="preserve">p</w:t>
+      </w:r>
+      <w:r>
+        <w:rPr>
+          <w:rFonts w:ascii="MS Mincho" w:cs="MS Mincho" w:eastAsia="MS Mincho" w:hAnsi="MS Mincho"/>
+          <w:sz w:val="20"/>
+          <w:szCs w:val="20"/>
+        </w:rPr>
+        <w:t xml:space="preserve"> = 0.002）。一方、</w:t>
+      </w:r>
+      <w:r>
+        <w:rPr>
+          <w:rFonts w:ascii="Cambria Math" w:cs="Cambria Math" w:eastAsia="Cambria Math" w:hAnsi="Cambria Math"/>
+          <w:i/>
+          <w:iCs/>
+          <w:sz w:val="20"/>
+          <w:szCs w:val="20"/>
+        </w:rPr>
+        <w:t xml:space="preserve">λ</w:t>
+      </w:r>
+      <w:r>
+        <w:rPr>
+          <w:rFonts w:ascii="MS Mincho" w:cs="MS Mincho" w:eastAsia="MS Mincho" w:hAnsi="MS Mincho"/>
+          <w:sz w:val="20"/>
+          <w:szCs w:val="20"/>
+        </w:rPr>
+        <w:t xml:space="preserve"> = 0（再構成損失のみの追加学習）のtest CERは0.235とTAPS SEから改善しなかったことから、改善は追加学習そのものではなくCE損失によるものである。再構成損失を除いたCE onlyは0.203であり、再構成損失の併用が有効であった。</w:t>
+      </w:r>
+    </w:p>
+    <w:p>
+      <w:pPr>
+        <w:spacing w:after="60" w:line="300"/>
+      </w:pPr>
+      <w:r>
+        <w:rPr>
+          <w:rFonts w:ascii="MS Mincho" w:cs="MS Mincho" w:eastAsia="MS Mincho" w:hAnsi="MS Mincho"/>
+          <w:sz w:val="20"/>
+          <w:szCs w:val="20"/>
+        </w:rPr>
+        <w:t xml:space="preserve">未正規化のCERでは、TAPS SEの0.252から提案手法の0.200へと20.8%の低下に見える。しかし文末に句読点が付く発話の割合は、TAPS SEの94%に対し提案手法では1%であった。正解テキストに句読点がないため、CE損失はWhisperが句読点を出力しないようにSE出力を変化させており、未正規化の改善幅（0.052）のうち34%（0.018）はこの効果による。句点率は</w:t>
+      </w:r>
+      <w:r>
+        <w:rPr>
+          <w:rFonts w:ascii="Cambria Math" w:cs="Cambria Math" w:eastAsia="Cambria Math" w:hAnsi="Cambria Math"/>
+          <w:i/>
+          <w:iCs/>
+          <w:sz w:val="20"/>
+          <w:szCs w:val="20"/>
+        </w:rPr>
+        <w:t xml:space="preserve">λ</w:t>
+      </w:r>
+      <w:r>
+        <w:rPr>
+          <w:rFonts w:ascii="MS Mincho" w:cs="MS Mincho" w:eastAsia="MS Mincho" w:hAnsi="MS Mincho"/>
+          <w:sz w:val="20"/>
+          <w:szCs w:val="20"/>
+        </w:rPr>
+        <w:t xml:space="preserve"> = 2以上で急激に低下した（表1）。</w:t>
       </w:r>
     </w:p>
     <w:tbl>
@@ -1080,7 +1106,7 @@
                 <w:sz w:val="17"/>
                 <w:szCs w:val="17"/>
               </w:rPr>
-              <w:t xml:space="preserve">—</w:t>
+              <w:t xml:space="preserve">0.265</w:t>
             </w:r>
           </w:p>
         </w:tc>
@@ -1111,7 +1137,7 @@
                 <w:sz w:val="17"/>
                 <w:szCs w:val="17"/>
               </w:rPr>
-              <w:t xml:space="preserve">—</w:t>
+              <w:t xml:space="preserve">0.230</w:t>
             </w:r>
           </w:p>
         </w:tc>
@@ -1142,7 +1168,7 @@
                 <w:sz w:val="17"/>
                 <w:szCs w:val="17"/>
               </w:rPr>
-              <w:t xml:space="preserve">—</w:t>
+              <w:t xml:space="preserve">0.252</w:t>
             </w:r>
           </w:p>
         </w:tc>
@@ -1173,7 +1199,7 @@
                 <w:sz w:val="17"/>
                 <w:szCs w:val="17"/>
               </w:rPr>
-              <w:t xml:space="preserve">—</w:t>
+              <w:t xml:space="preserve">94%</w:t>
             </w:r>
           </w:p>
         </w:tc>
@@ -1237,7 +1263,7 @@
                 <w:sz w:val="17"/>
                 <w:szCs w:val="17"/>
               </w:rPr>
-              <w:t xml:space="preserve">—</w:t>
+              <w:t xml:space="preserve">0.265</w:t>
             </w:r>
           </w:p>
         </w:tc>
@@ -1268,7 +1294,7 @@
                 <w:sz w:val="17"/>
                 <w:szCs w:val="17"/>
               </w:rPr>
-              <w:t xml:space="preserve">—</w:t>
+              <w:t xml:space="preserve">0.235</w:t>
             </w:r>
           </w:p>
         </w:tc>
@@ -1299,7 +1325,7 @@
                 <w:sz w:val="17"/>
                 <w:szCs w:val="17"/>
               </w:rPr>
-              <w:t xml:space="preserve">—</w:t>
+              <w:t xml:space="preserve">0.257</w:t>
             </w:r>
           </w:p>
         </w:tc>
@@ -1330,7 +1356,7 @@
                 <w:sz w:val="17"/>
                 <w:szCs w:val="17"/>
               </w:rPr>
-              <w:t xml:space="preserve">—</w:t>
+              <w:t xml:space="preserve">95%</w:t>
             </w:r>
           </w:p>
         </w:tc>
@@ -1394,7 +1420,7 @@
                 <w:sz w:val="17"/>
                 <w:szCs w:val="17"/>
               </w:rPr>
-              <w:t xml:space="preserve">—</w:t>
+              <w:t xml:space="preserve">0.244</w:t>
             </w:r>
           </w:p>
         </w:tc>
@@ -1425,7 +1451,7 @@
                 <w:sz w:val="17"/>
                 <w:szCs w:val="17"/>
               </w:rPr>
-              <w:t xml:space="preserve">—</w:t>
+              <w:t xml:space="preserve">0.208</w:t>
             </w:r>
           </w:p>
         </w:tc>
@@ -1456,7 +1482,7 @@
                 <w:sz w:val="17"/>
                 <w:szCs w:val="17"/>
               </w:rPr>
-              <w:t xml:space="preserve">—</w:t>
+              <w:t xml:space="preserve">0.228</w:t>
             </w:r>
           </w:p>
         </w:tc>
@@ -1487,7 +1513,7 @@
                 <w:sz w:val="17"/>
                 <w:szCs w:val="17"/>
               </w:rPr>
-              <w:t xml:space="preserve">—</w:t>
+              <w:t xml:space="preserve">90%</w:t>
             </w:r>
           </w:p>
         </w:tc>
@@ -1551,7 +1577,7 @@
                 <w:sz w:val="17"/>
                 <w:szCs w:val="17"/>
               </w:rPr>
-              <w:t xml:space="preserve">—</w:t>
+              <w:t xml:space="preserve">0.231</w:t>
             </w:r>
           </w:p>
         </w:tc>
@@ -1582,7 +1608,7 @@
                 <w:sz w:val="17"/>
                 <w:szCs w:val="17"/>
               </w:rPr>
-              <w:t xml:space="preserve">—</w:t>
+              <w:t xml:space="preserve">0.200</w:t>
             </w:r>
           </w:p>
         </w:tc>
@@ -1613,7 +1639,7 @@
                 <w:sz w:val="17"/>
                 <w:szCs w:val="17"/>
               </w:rPr>
-              <w:t xml:space="preserve">—</w:t>
+              <w:t xml:space="preserve">0.216</w:t>
             </w:r>
           </w:p>
         </w:tc>
@@ -1644,7 +1670,7 @@
                 <w:sz w:val="17"/>
                 <w:szCs w:val="17"/>
               </w:rPr>
-              <w:t xml:space="preserve">—</w:t>
+              <w:t xml:space="preserve">67%</w:t>
             </w:r>
           </w:p>
         </w:tc>
@@ -1708,7 +1734,7 @@
                 <w:sz w:val="17"/>
                 <w:szCs w:val="17"/>
               </w:rPr>
-              <w:t xml:space="preserve">—</w:t>
+              <w:t xml:space="preserve">0.232</w:t>
             </w:r>
           </w:p>
         </w:tc>
@@ -1739,7 +1765,7 @@
                 <w:sz w:val="17"/>
                 <w:szCs w:val="17"/>
               </w:rPr>
-              <w:t xml:space="preserve">—</w:t>
+              <w:t xml:space="preserve">0.199</w:t>
             </w:r>
           </w:p>
         </w:tc>
@@ -1770,7 +1796,7 @@
                 <w:sz w:val="17"/>
                 <w:szCs w:val="17"/>
               </w:rPr>
-              <w:t xml:space="preserve">—</w:t>
+              <w:t xml:space="preserve">0.203</w:t>
             </w:r>
           </w:p>
         </w:tc>
@@ -1801,7 +1827,7 @@
                 <w:sz w:val="17"/>
                 <w:szCs w:val="17"/>
               </w:rPr>
-              <w:t xml:space="preserve">—</w:t>
+              <w:t xml:space="preserve">0%</w:t>
             </w:r>
           </w:p>
         </w:tc>
@@ -1834,7 +1860,7 @@
                 <w:sz w:val="17"/>
                 <w:szCs w:val="17"/>
               </w:rPr>
-              <w:t xml:space="preserve">CE λ=10</w:t>
+              <w:t xml:space="preserve">CE λ=10（選択）</w:t>
             </w:r>
           </w:p>
         </w:tc>
@@ -1865,7 +1891,7 @@
                 <w:sz w:val="17"/>
                 <w:szCs w:val="17"/>
               </w:rPr>
-              <w:t xml:space="preserve">—</w:t>
+              <w:t xml:space="preserve">0.227</w:t>
             </w:r>
           </w:p>
         </w:tc>
@@ -1896,7 +1922,7 @@
                 <w:sz w:val="17"/>
                 <w:szCs w:val="17"/>
               </w:rPr>
-              <w:t xml:space="preserve">—</w:t>
+              <w:t xml:space="preserve">0.196</w:t>
             </w:r>
           </w:p>
         </w:tc>
@@ -1927,7 +1953,7 @@
                 <w:sz w:val="17"/>
                 <w:szCs w:val="17"/>
               </w:rPr>
-              <w:t xml:space="preserve">—</w:t>
+              <w:t xml:space="preserve">0.200</w:t>
             </w:r>
           </w:p>
         </w:tc>
@@ -1958,7 +1984,7 @@
                 <w:sz w:val="17"/>
                 <w:szCs w:val="17"/>
               </w:rPr>
-              <w:t xml:space="preserve">—</w:t>
+              <w:t xml:space="preserve">1%</w:t>
             </w:r>
           </w:p>
         </w:tc>
@@ -2022,7 +2048,7 @@
                 <w:sz w:val="17"/>
                 <w:szCs w:val="17"/>
               </w:rPr>
-              <w:t xml:space="preserve">—</w:t>
+              <w:t xml:space="preserve">0.238</w:t>
             </w:r>
           </w:p>
         </w:tc>
@@ -2053,7 +2079,7 @@
                 <w:sz w:val="17"/>
                 <w:szCs w:val="17"/>
               </w:rPr>
-              <w:t xml:space="preserve">—</w:t>
+              <w:t xml:space="preserve">0.203</w:t>
             </w:r>
           </w:p>
         </w:tc>
@@ -2084,7 +2110,7 @@
                 <w:sz w:val="17"/>
                 <w:szCs w:val="17"/>
               </w:rPr>
-              <w:t xml:space="preserve">—</w:t>
+              <w:t xml:space="preserve">0.205</w:t>
             </w:r>
           </w:p>
         </w:tc>
@@ -2115,7 +2141,7 @@
                 <w:sz w:val="17"/>
                 <w:szCs w:val="17"/>
               </w:rPr>
-              <w:t xml:space="preserve">—</w:t>
+              <w:t xml:space="preserve">0%</w:t>
             </w:r>
           </w:p>
         </w:tc>
@@ -2134,7 +2160,7 @@
           <w:sz w:val="17"/>
           <w:szCs w:val="17"/>
         </w:rPr>
-        <w:t xml:space="preserve">表1: λごとのCER（Whisper-small、正規化後。rawは未正規化）【64待ち】</w:t>
+        <w:t xml:space="preserve">表1: λごとのCER（Whisper-small、正規化後。rawは未正規化、句点率はtest）</w:t>
       </w:r>
     </w:p>
     <w:p>
@@ -2163,26 +2189,7 @@
           <w:sz w:val="20"/>
           <w:szCs w:val="20"/>
         </w:rPr>
-        <w:t xml:space="preserve">表2に、SE条件と認識器の組み合わせごとのCERを示す。</w:t>
-      </w:r>
-      <w:r>
-        <w:rPr>
-          <w:rFonts w:ascii="MS Mincho" w:cs="MS Mincho" w:eastAsia="MS Mincho" w:hAnsi="MS Mincho"/>
-          <w:b/>
-          <w:bCs/>
-          <w:color w:val="C00000"/>
-          <w:sz w:val="20"/>
-          <w:szCs w:val="20"/>
-        </w:rPr>
-        <w:t xml:space="preserve">【64・62待ち】</w:t>
-      </w:r>
-      <w:r>
-        <w:rPr>
-          <w:rFonts w:ascii="MS Mincho" w:cs="MS Mincho" w:eastAsia="MS Mincho" w:hAnsi="MS Mincho"/>
-          <w:sz w:val="20"/>
-          <w:szCs w:val="20"/>
-        </w:rPr>
-        <w:t xml:space="preserve"> Whisper系列内では提案手法がTAPS SEよりCERを下げる一方、CTC系のMMS-1BとXLS-Rでは提案手法がTAPS SEよりCERを上げた。</w:t>
+        <w:t xml:space="preserve">表2に、SE条件と認識器の組み合わせごとのCERを示す。Whisper-mediumでは提案手法がTAPS SEからCERを14.2%下げ（10/10話者、</w:t>
       </w:r>
       <w:r>
         <w:rPr>
@@ -2192,6 +2199,73 @@
           <w:sz w:val="20"/>
           <w:szCs w:val="20"/>
         </w:rPr>
+        <w:t xml:space="preserve">p</w:t>
+      </w:r>
+      <w:r>
+        <w:rPr>
+          <w:rFonts w:ascii="MS Mincho" w:cs="MS Mincho" w:eastAsia="MS Mincho" w:hAnsi="MS Mincho"/>
+          <w:sz w:val="20"/>
+          <w:szCs w:val="20"/>
+        </w:rPr>
+        <w:t xml:space="preserve"> = 0.002）、改善が持ち越された。一方Whisper-baseでは1.8%の低下にとどまり、有意ではなかった（6/10話者、</w:t>
+      </w:r>
+      <w:r>
+        <w:rPr>
+          <w:rFonts w:ascii="Cambria Math" w:cs="Cambria Math" w:eastAsia="Cambria Math" w:hAnsi="Cambria Math"/>
+          <w:i/>
+          <w:iCs/>
+          <w:sz w:val="20"/>
+          <w:szCs w:val="20"/>
+        </w:rPr>
+        <w:t xml:space="preserve">p</w:t>
+      </w:r>
+      <w:r>
+        <w:rPr>
+          <w:rFonts w:ascii="MS Mincho" w:cs="MS Mincho" w:eastAsia="MS Mincho" w:hAnsi="MS Mincho"/>
+          <w:sz w:val="20"/>
+          <w:szCs w:val="20"/>
+        </w:rPr>
+        <w:t xml:space="preserve"> = 0.23）。</w:t>
+      </w:r>
+    </w:p>
+    <w:p>
+      <w:pPr>
+        <w:spacing w:after="60" w:line="300"/>
+      </w:pPr>
+      <w:r>
+        <w:rPr>
+          <w:rFonts w:ascii="MS Mincho" w:cs="MS Mincho" w:eastAsia="MS Mincho" w:hAnsi="MS Mincho"/>
+          <w:sz w:val="20"/>
+          <w:szCs w:val="20"/>
+        </w:rPr>
+        <w:t xml:space="preserve">系列外では、XLS-Rで提案手法がTAPS SEよりCERを25.8%上げた（0/10話者、</w:t>
+      </w:r>
+      <w:r>
+        <w:rPr>
+          <w:rFonts w:ascii="Cambria Math" w:cs="Cambria Math" w:eastAsia="Cambria Math" w:hAnsi="Cambria Math"/>
+          <w:i/>
+          <w:iCs/>
+          <w:sz w:val="20"/>
+          <w:szCs w:val="20"/>
+        </w:rPr>
+        <w:t xml:space="preserve">p</w:t>
+      </w:r>
+      <w:r>
+        <w:rPr>
+          <w:rFonts w:ascii="MS Mincho" w:cs="MS Mincho" w:eastAsia="MS Mincho" w:hAnsi="MS Mincho"/>
+          <w:sz w:val="20"/>
+          <w:szCs w:val="20"/>
+        </w:rPr>
+        <w:t xml:space="preserve"> = 0.002）。</w:t>
+      </w:r>
+      <w:r>
+        <w:rPr>
+          <w:rFonts w:ascii="Cambria Math" w:cs="Cambria Math" w:eastAsia="Cambria Math" w:hAnsi="Cambria Math"/>
+          <w:i/>
+          <w:iCs/>
+          <w:sz w:val="20"/>
+          <w:szCs w:val="20"/>
+        </w:rPr>
         <w:t xml:space="preserve">λ</w:t>
       </w:r>
       <w:r>
@@ -2200,18 +2274,56 @@
           <w:sz w:val="20"/>
           <w:szCs w:val="20"/>
         </w:rPr>
-        <w:t xml:space="preserve"> = 0ではCTC系でもTAPS SEと同程度であることから、この悪化はCE損失によるものである。Enc L1はいずれの認識器でもTAPS SEとほぼ同等であった。</w:t>
-      </w:r>
-      <w:r>
-        <w:rPr>
-          <w:rFonts w:ascii="MS Mincho" w:cs="MS Mincho" w:eastAsia="MS Mincho" w:hAnsi="MS Mincho"/>
-          <w:b/>
-          <w:bCs/>
-          <w:color w:val="C00000"/>
-          <w:sz w:val="20"/>
-          <w:szCs w:val="20"/>
-        </w:rPr>
-        <w:t xml:space="preserve">【FT Whisperの列の解釈を追記】</w:t>
+        <w:t xml:space="preserve"> = 0と比べても20.9%悪化しており（0/10話者）、この悪化はCE損失によるものである。MMS-1Bでは差は有意でなかった（+1.0%、</w:t>
+      </w:r>
+      <w:r>
+        <w:rPr>
+          <w:rFonts w:ascii="Cambria Math" w:cs="Cambria Math" w:eastAsia="Cambria Math" w:hAnsi="Cambria Math"/>
+          <w:i/>
+          <w:iCs/>
+          <w:sz w:val="20"/>
+          <w:szCs w:val="20"/>
+        </w:rPr>
+        <w:t xml:space="preserve">p</w:t>
+      </w:r>
+      <w:r>
+        <w:rPr>
+          <w:rFonts w:ascii="MS Mincho" w:cs="MS Mincho" w:eastAsia="MS Mincho" w:hAnsi="MS Mincho"/>
+          <w:sz w:val="20"/>
+          <w:szCs w:val="20"/>
+        </w:rPr>
+        <w:t xml:space="preserve"> = 0.38）。Enc L1はいずれの認識器でもTAPS SEとほぼ同等であった。</w:t>
+      </w:r>
+    </w:p>
+    <w:p>
+      <w:pPr>
+        <w:spacing w:after="60" w:line="300"/>
+      </w:pPr>
+      <w:r>
+        <w:rPr>
+          <w:rFonts w:ascii="MS Mincho" w:cs="MS Mincho" w:eastAsia="MS Mincho" w:hAnsi="MS Mincho"/>
+          <w:sz w:val="20"/>
+          <w:szCs w:val="20"/>
+        </w:rPr>
+        <w:t xml:space="preserve">FT WhisperはSEなしで0.138と最も低く、TAPS SEを接続すると0.146に悪化した。提案手法を接続すると平均は0.121に下がったが、改善は10話者中5話者にとどまり有意ではなかった（</w:t>
+      </w:r>
+      <w:r>
+        <w:rPr>
+          <w:rFonts w:ascii="Cambria Math" w:cs="Cambria Math" w:eastAsia="Cambria Math" w:hAnsi="Cambria Math"/>
+          <w:i/>
+          <w:iCs/>
+          <w:sz w:val="20"/>
+          <w:szCs w:val="20"/>
+        </w:rPr>
+        <w:t xml:space="preserve">p</w:t>
+      </w:r>
+      <w:r>
+        <w:rPr>
+          <w:rFonts w:ascii="MS Mincho" w:cs="MS Mincho" w:eastAsia="MS Mincho" w:hAnsi="MS Mincho"/>
+          <w:sz w:val="20"/>
+          <w:szCs w:val="20"/>
+        </w:rPr>
+        <w:t xml:space="preserve"> = 0.38）。提案手法単体（Whisper-smallで0.196）はFT Whisperに及ばない。</w:t>
       </w:r>
     </w:p>
     <w:tbl>
@@ -2534,7 +2646,7 @@
                 <w:sz w:val="17"/>
                 <w:szCs w:val="17"/>
               </w:rPr>
-              <w:t xml:space="preserve">—</w:t>
+              <w:t xml:space="preserve">0.655</w:t>
             </w:r>
           </w:p>
         </w:tc>
@@ -2565,7 +2677,7 @@
                 <w:sz w:val="17"/>
                 <w:szCs w:val="17"/>
               </w:rPr>
-              <w:t xml:space="preserve">—</w:t>
+              <w:t xml:space="preserve">0.446</w:t>
             </w:r>
           </w:p>
         </w:tc>
@@ -2596,7 +2708,7 @@
                 <w:sz w:val="17"/>
                 <w:szCs w:val="17"/>
               </w:rPr>
-              <w:t xml:space="preserve">—</w:t>
+              <w:t xml:space="preserve">0.337</w:t>
             </w:r>
           </w:p>
         </w:tc>
@@ -2627,7 +2739,7 @@
                 <w:sz w:val="17"/>
                 <w:szCs w:val="17"/>
               </w:rPr>
-              <w:t xml:space="preserve">—</w:t>
+              <w:t xml:space="preserve">0.138</w:t>
             </w:r>
           </w:p>
         </w:tc>
@@ -2658,7 +2770,7 @@
                 <w:sz w:val="17"/>
                 <w:szCs w:val="17"/>
               </w:rPr>
-              <w:t xml:space="preserve">—</w:t>
+              <w:t xml:space="preserve">0.497</w:t>
             </w:r>
           </w:p>
         </w:tc>
@@ -2689,7 +2801,7 @@
                 <w:sz w:val="17"/>
                 <w:szCs w:val="17"/>
               </w:rPr>
-              <w:t xml:space="preserve">—</w:t>
+              <w:t xml:space="preserve">0.584</w:t>
             </w:r>
           </w:p>
         </w:tc>
@@ -2753,7 +2865,7 @@
                 <w:sz w:val="17"/>
                 <w:szCs w:val="17"/>
               </w:rPr>
-              <w:t xml:space="preserve">—</w:t>
+              <w:t xml:space="preserve">0.273</w:t>
             </w:r>
           </w:p>
         </w:tc>
@@ -2784,7 +2896,7 @@
                 <w:sz w:val="17"/>
                 <w:szCs w:val="17"/>
               </w:rPr>
-              <w:t xml:space="preserve">—</w:t>
+              <w:t xml:space="preserve">0.230</w:t>
             </w:r>
           </w:p>
         </w:tc>
@@ -2815,7 +2927,7 @@
                 <w:sz w:val="17"/>
                 <w:szCs w:val="17"/>
               </w:rPr>
-              <w:t xml:space="preserve">—</w:t>
+              <w:t xml:space="preserve">0.197</w:t>
             </w:r>
           </w:p>
         </w:tc>
@@ -2846,7 +2958,7 @@
                 <w:sz w:val="17"/>
                 <w:szCs w:val="17"/>
               </w:rPr>
-              <w:t xml:space="preserve">—</w:t>
+              <w:t xml:space="preserve">0.146</w:t>
             </w:r>
           </w:p>
         </w:tc>
@@ -2877,7 +2989,7 @@
                 <w:sz w:val="17"/>
                 <w:szCs w:val="17"/>
               </w:rPr>
-              <w:t xml:space="preserve">—</w:t>
+              <w:t xml:space="preserve">0.350</w:t>
             </w:r>
           </w:p>
         </w:tc>
@@ -2908,7 +3020,7 @@
                 <w:sz w:val="17"/>
                 <w:szCs w:val="17"/>
               </w:rPr>
-              <w:t xml:space="preserve">—</w:t>
+              <w:t xml:space="preserve">0.222</w:t>
             </w:r>
           </w:p>
         </w:tc>
@@ -2972,6 +3084,99 @@
                 <w:sz w:val="17"/>
                 <w:szCs w:val="17"/>
               </w:rPr>
+              <w:t xml:space="preserve">0.277</w:t>
+            </w:r>
+          </w:p>
+        </w:tc>
+        <w:tc>
+          <w:tcPr>
+            <w:tcW w:type="dxa" w:w="580"/>
+            <w:tcBorders>
+              <w:top w:val="single" w:color="888888" w:sz="1"/>
+              <w:left w:val="single" w:color="888888" w:sz="1"/>
+              <w:bottom w:val="single" w:color="888888" w:sz="1"/>
+              <w:right w:val="single" w:color="888888" w:sz="1"/>
+            </w:tcBorders>
+            <w:tcMar>
+              <w:top w:type="dxa" w:w="20"/>
+              <w:left w:type="dxa" w:w="60"/>
+              <w:bottom w:type="dxa" w:w="20"/>
+              <w:right w:type="dxa" w:w="60"/>
+            </w:tcMar>
+          </w:tcPr>
+          <w:p>
+            <w:pPr>
+              <w:spacing w:after="0" w:line="240"/>
+              <w:jc w:val="center"/>
+            </w:pPr>
+            <w:r>
+              <w:rPr>
+                <w:rFonts w:ascii="MS Mincho" w:cs="MS Mincho" w:eastAsia="MS Mincho" w:hAnsi="MS Mincho"/>
+                <w:sz w:val="17"/>
+                <w:szCs w:val="17"/>
+              </w:rPr>
+              <w:t xml:space="preserve">0.230</w:t>
+            </w:r>
+          </w:p>
+        </w:tc>
+        <w:tc>
+          <w:tcPr>
+            <w:tcW w:type="dxa" w:w="580"/>
+            <w:tcBorders>
+              <w:top w:val="single" w:color="888888" w:sz="1"/>
+              <w:left w:val="single" w:color="888888" w:sz="1"/>
+              <w:bottom w:val="single" w:color="888888" w:sz="1"/>
+              <w:right w:val="single" w:color="888888" w:sz="1"/>
+            </w:tcBorders>
+            <w:tcMar>
+              <w:top w:type="dxa" w:w="20"/>
+              <w:left w:type="dxa" w:w="60"/>
+              <w:bottom w:type="dxa" w:w="20"/>
+              <w:right w:type="dxa" w:w="60"/>
+            </w:tcMar>
+          </w:tcPr>
+          <w:p>
+            <w:pPr>
+              <w:spacing w:after="0" w:line="240"/>
+              <w:jc w:val="center"/>
+            </w:pPr>
+            <w:r>
+              <w:rPr>
+                <w:rFonts w:ascii="MS Mincho" w:cs="MS Mincho" w:eastAsia="MS Mincho" w:hAnsi="MS Mincho"/>
+                <w:sz w:val="17"/>
+                <w:szCs w:val="17"/>
+              </w:rPr>
+              <w:t xml:space="preserve">0.197</w:t>
+            </w:r>
+          </w:p>
+        </w:tc>
+        <w:tc>
+          <w:tcPr>
+            <w:tcW w:type="dxa" w:w="580"/>
+            <w:tcBorders>
+              <w:top w:val="single" w:color="888888" w:sz="1"/>
+              <w:left w:val="single" w:color="888888" w:sz="1"/>
+              <w:bottom w:val="single" w:color="888888" w:sz="1"/>
+              <w:right w:val="single" w:color="888888" w:sz="1"/>
+            </w:tcBorders>
+            <w:tcMar>
+              <w:top w:type="dxa" w:w="20"/>
+              <w:left w:type="dxa" w:w="60"/>
+              <w:bottom w:type="dxa" w:w="20"/>
+              <w:right w:type="dxa" w:w="60"/>
+            </w:tcMar>
+          </w:tcPr>
+          <w:p>
+            <w:pPr>
+              <w:spacing w:after="0" w:line="240"/>
+              <w:jc w:val="center"/>
+            </w:pPr>
+            <w:r>
+              <w:rPr>
+                <w:rFonts w:ascii="MS Mincho" w:cs="MS Mincho" w:eastAsia="MS Mincho" w:hAnsi="MS Mincho"/>
+                <w:sz w:val="17"/>
+                <w:szCs w:val="17"/>
+              </w:rPr>
               <w:t xml:space="preserve">—</w:t>
             </w:r>
           </w:p>
@@ -3003,7 +3208,7 @@
                 <w:sz w:val="17"/>
                 <w:szCs w:val="17"/>
               </w:rPr>
-              <w:t xml:space="preserve">—</w:t>
+              <w:t xml:space="preserve">0.353</w:t>
             </w:r>
           </w:p>
         </w:tc>
@@ -3034,100 +3239,7 @@
                 <w:sz w:val="17"/>
                 <w:szCs w:val="17"/>
               </w:rPr>
-              <w:t xml:space="preserve">—</w:t>
-            </w:r>
-          </w:p>
-        </w:tc>
-        <w:tc>
-          <w:tcPr>
-            <w:tcW w:type="dxa" w:w="580"/>
-            <w:tcBorders>
-              <w:top w:val="single" w:color="888888" w:sz="1"/>
-              <w:left w:val="single" w:color="888888" w:sz="1"/>
-              <w:bottom w:val="single" w:color="888888" w:sz="1"/>
-              <w:right w:val="single" w:color="888888" w:sz="1"/>
-            </w:tcBorders>
-            <w:tcMar>
-              <w:top w:type="dxa" w:w="20"/>
-              <w:left w:type="dxa" w:w="60"/>
-              <w:bottom w:type="dxa" w:w="20"/>
-              <w:right w:type="dxa" w:w="60"/>
-            </w:tcMar>
-          </w:tcPr>
-          <w:p>
-            <w:pPr>
-              <w:spacing w:after="0" w:line="240"/>
-              <w:jc w:val="center"/>
-            </w:pPr>
-            <w:r>
-              <w:rPr>
-                <w:rFonts w:ascii="MS Mincho" w:cs="MS Mincho" w:eastAsia="MS Mincho" w:hAnsi="MS Mincho"/>
-                <w:sz w:val="17"/>
-                <w:szCs w:val="17"/>
-              </w:rPr>
-              <w:t xml:space="preserve">—</w:t>
-            </w:r>
-          </w:p>
-        </w:tc>
-        <w:tc>
-          <w:tcPr>
-            <w:tcW w:type="dxa" w:w="580"/>
-            <w:tcBorders>
-              <w:top w:val="single" w:color="888888" w:sz="1"/>
-              <w:left w:val="single" w:color="888888" w:sz="1"/>
-              <w:bottom w:val="single" w:color="888888" w:sz="1"/>
-              <w:right w:val="single" w:color="888888" w:sz="1"/>
-            </w:tcBorders>
-            <w:tcMar>
-              <w:top w:type="dxa" w:w="20"/>
-              <w:left w:type="dxa" w:w="60"/>
-              <w:bottom w:type="dxa" w:w="20"/>
-              <w:right w:type="dxa" w:w="60"/>
-            </w:tcMar>
-          </w:tcPr>
-          <w:p>
-            <w:pPr>
-              <w:spacing w:after="0" w:line="240"/>
-              <w:jc w:val="center"/>
-            </w:pPr>
-            <w:r>
-              <w:rPr>
-                <w:rFonts w:ascii="MS Mincho" w:cs="MS Mincho" w:eastAsia="MS Mincho" w:hAnsi="MS Mincho"/>
-                <w:sz w:val="17"/>
-                <w:szCs w:val="17"/>
-              </w:rPr>
-              <w:t xml:space="preserve">—</w:t>
-            </w:r>
-          </w:p>
-        </w:tc>
-        <w:tc>
-          <w:tcPr>
-            <w:tcW w:type="dxa" w:w="580"/>
-            <w:tcBorders>
-              <w:top w:val="single" w:color="888888" w:sz="1"/>
-              <w:left w:val="single" w:color="888888" w:sz="1"/>
-              <w:bottom w:val="single" w:color="888888" w:sz="1"/>
-              <w:right w:val="single" w:color="888888" w:sz="1"/>
-            </w:tcBorders>
-            <w:tcMar>
-              <w:top w:type="dxa" w:w="20"/>
-              <w:left w:type="dxa" w:w="60"/>
-              <w:bottom w:type="dxa" w:w="20"/>
-              <w:right w:type="dxa" w:w="60"/>
-            </w:tcMar>
-          </w:tcPr>
-          <w:p>
-            <w:pPr>
-              <w:spacing w:after="0" w:line="240"/>
-              <w:jc w:val="center"/>
-            </w:pPr>
-            <w:r>
-              <w:rPr>
-                <w:rFonts w:ascii="MS Mincho" w:cs="MS Mincho" w:eastAsia="MS Mincho" w:hAnsi="MS Mincho"/>
-                <w:sz w:val="17"/>
-                <w:szCs w:val="17"/>
-              </w:rPr>
-              <w:t xml:space="preserve">—</w:t>
+              <w:t xml:space="preserve">0.220</w:t>
             </w:r>
           </w:p>
         </w:tc>
@@ -3222,6 +3334,37 @@
                 <w:sz w:val="17"/>
                 <w:szCs w:val="17"/>
               </w:rPr>
+              <w:t xml:space="preserve">0.235</w:t>
+            </w:r>
+          </w:p>
+        </w:tc>
+        <w:tc>
+          <w:tcPr>
+            <w:tcW w:type="dxa" w:w="580"/>
+            <w:tcBorders>
+              <w:top w:val="single" w:color="888888" w:sz="1"/>
+              <w:left w:val="single" w:color="888888" w:sz="1"/>
+              <w:bottom w:val="single" w:color="888888" w:sz="1"/>
+              <w:right w:val="single" w:color="888888" w:sz="1"/>
+            </w:tcBorders>
+            <w:tcMar>
+              <w:top w:type="dxa" w:w="20"/>
+              <w:left w:type="dxa" w:w="60"/>
+              <w:bottom w:type="dxa" w:w="20"/>
+              <w:right w:type="dxa" w:w="60"/>
+            </w:tcMar>
+          </w:tcPr>
+          <w:p>
+            <w:pPr>
+              <w:spacing w:after="0" w:line="240"/>
+              <w:jc w:val="center"/>
+            </w:pPr>
+            <w:r>
+              <w:rPr>
+                <w:rFonts w:ascii="MS Mincho" w:cs="MS Mincho" w:eastAsia="MS Mincho" w:hAnsi="MS Mincho"/>
+                <w:sz w:val="17"/>
+                <w:szCs w:val="17"/>
+              </w:rPr>
               <w:t xml:space="preserve">—</w:t>
             </w:r>
           </w:p>
@@ -3284,7 +3427,7 @@
                 <w:sz w:val="17"/>
                 <w:szCs w:val="17"/>
               </w:rPr>
-              <w:t xml:space="preserve">—</w:t>
+              <w:t xml:space="preserve">0.358</w:t>
             </w:r>
           </w:p>
         </w:tc>
@@ -3315,38 +3458,7 @@
                 <w:sz w:val="17"/>
                 <w:szCs w:val="17"/>
               </w:rPr>
-              <w:t xml:space="preserve">—</w:t>
-            </w:r>
-          </w:p>
-        </w:tc>
-        <w:tc>
-          <w:tcPr>
-            <w:tcW w:type="dxa" w:w="580"/>
-            <w:tcBorders>
-              <w:top w:val="single" w:color="888888" w:sz="1"/>
-              <w:left w:val="single" w:color="888888" w:sz="1"/>
-              <w:bottom w:val="single" w:color="888888" w:sz="1"/>
-              <w:right w:val="single" w:color="888888" w:sz="1"/>
-            </w:tcBorders>
-            <w:tcMar>
-              <w:top w:type="dxa" w:w="20"/>
-              <w:left w:type="dxa" w:w="60"/>
-              <w:bottom w:type="dxa" w:w="20"/>
-              <w:right w:type="dxa" w:w="60"/>
-            </w:tcMar>
-          </w:tcPr>
-          <w:p>
-            <w:pPr>
-              <w:spacing w:after="0" w:line="240"/>
-              <w:jc w:val="center"/>
-            </w:pPr>
-            <w:r>
-              <w:rPr>
-                <w:rFonts w:ascii="MS Mincho" w:cs="MS Mincho" w:eastAsia="MS Mincho" w:hAnsi="MS Mincho"/>
-                <w:sz w:val="17"/>
-                <w:szCs w:val="17"/>
-              </w:rPr>
-              <w:t xml:space="preserve">—</w:t>
+              <w:t xml:space="preserve">0.231</w:t>
             </w:r>
           </w:p>
         </w:tc>
@@ -3410,7 +3522,7 @@
                 <w:sz w:val="17"/>
                 <w:szCs w:val="17"/>
               </w:rPr>
-              <w:t xml:space="preserve">—</w:t>
+              <w:t xml:space="preserve">0.268</w:t>
             </w:r>
           </w:p>
         </w:tc>
@@ -3441,7 +3553,7 @@
                 <w:sz w:val="17"/>
                 <w:szCs w:val="17"/>
               </w:rPr>
-              <w:t xml:space="preserve">—</w:t>
+              <w:t xml:space="preserve">0.196</w:t>
             </w:r>
           </w:p>
         </w:tc>
@@ -3472,7 +3584,7 @@
                 <w:sz w:val="17"/>
                 <w:szCs w:val="17"/>
               </w:rPr>
-              <w:t xml:space="preserve">—</w:t>
+              <w:t xml:space="preserve">0.169</w:t>
             </w:r>
           </w:p>
         </w:tc>
@@ -3503,7 +3615,7 @@
                 <w:sz w:val="17"/>
                 <w:szCs w:val="17"/>
               </w:rPr>
-              <w:t xml:space="preserve">—</w:t>
+              <w:t xml:space="preserve">0.121</w:t>
             </w:r>
           </w:p>
         </w:tc>
@@ -3534,7 +3646,7 @@
                 <w:sz w:val="17"/>
                 <w:szCs w:val="17"/>
               </w:rPr>
-              <w:t xml:space="preserve">—</w:t>
+              <w:t xml:space="preserve">0.354</w:t>
             </w:r>
           </w:p>
         </w:tc>
@@ -3565,7 +3677,7 @@
                 <w:sz w:val="17"/>
                 <w:szCs w:val="17"/>
               </w:rPr>
-              <w:t xml:space="preserve">—</w:t>
+              <w:t xml:space="preserve">0.279</w:t>
             </w:r>
           </w:p>
         </w:tc>
@@ -3584,7 +3696,7 @@
           <w:sz w:val="17"/>
           <w:szCs w:val="17"/>
         </w:rPr>
-        <w:t xml:space="preserve">表2: 認識器ごとのCER（正規化後、*は学習に使用）【64・62待ち】</w:t>
+        <w:t xml:space="preserve">表2: 認識器ごとのCER（正規化後、*は学習に使用、—は未評価）</w:t>
       </w:r>
     </w:p>
     <w:p>
@@ -3759,23 +3871,12 @@
           <w:sz w:val="20"/>
           <w:szCs w:val="20"/>
         </w:rPr>
-        <w:t xml:space="preserve">この櫛状成分がCERの改善を担っているかを調べるため、提案手法の出力の250 Hz格子位置にノッチフィルタを適用したところ、CERはほとんど変化しなかった（表3）。また、4 kHzを境に低域と高域をTAPS SEと提案手法で入れ替えると、提案手法の低域とTAPS SEの高域の組み合わせで提案手法とほぼ同じCERが得られた。したがって改善は主に4 kHz以下の変化によるもので、櫛状成分は副産物と考えられる。</w:t>
-      </w:r>
-      <w:r>
-        <w:rPr>
-          <w:rFonts w:ascii="MS Mincho" w:cs="MS Mincho" w:eastAsia="MS Mincho" w:hAnsi="MS Mincho"/>
-          <w:b/>
-          <w:bCs/>
-          <w:color w:val="C00000"/>
-          <w:sz w:val="20"/>
-          <w:szCs w:val="20"/>
-        </w:rPr>
-        <w:t xml:space="preserve">【62待ち：1000発話の値で確認】</w:t>
+        <w:t xml:space="preserve">この櫛状成分と帯域ごとの寄与を調べるため、提案手法の出力の250 Hz格子位置にノッチフィルタを適用し、また4 kHzを境に低域と高域をTAPS SEと提案手法で入れ替えた（表3）。ノッチの適用でCERは0.196から0.204へ上昇し（10/10話者で悪化）、櫛状成分は改善幅（0.035）の約1/4を担っていた。一方、提案手法の低域とTAPS SEの高域を組み合わせると0.201となり、改善幅の約83%が保たれた。したがって改善の大部分は4 kHz以下の変化によるものである。なお、TAPS SEの4 kHz以上を除去するとCERは0.221に下がり、TAPS SEが補間した高域はWhisperにとってむしろ不利であった。</w:t>
       </w:r>
     </w:p>
     <w:tbl>
       <w:tblPr>
-        <w:tblW w:type="dxa" w:w="3100"/>
+        <w:tblW w:type="dxa" w:w="3300"/>
         <w:tblBorders>
           <w:top w:val="single" w:color="auto" w:sz="4"/>
           <w:left w:val="single" w:color="auto" w:sz="4"/>
@@ -3786,13 +3887,13 @@
         </w:tblBorders>
       </w:tblPr>
       <w:tblGrid>
-        <w:gridCol w:w="2200"/>
+        <w:gridCol w:w="2400"/>
         <w:gridCol w:w="900"/>
       </w:tblGrid>
       <w:tr>
         <w:tc>
           <w:tcPr>
-            <w:tcW w:type="dxa" w:w="2200"/>
+            <w:tcW w:type="dxa" w:w="2400"/>
             <w:tcBorders>
               <w:top w:val="single" w:color="888888" w:sz="1"/>
               <w:left w:val="single" w:color="888888" w:sz="1"/>
@@ -3862,7 +3963,7 @@
       <w:tr>
         <w:tc>
           <w:tcPr>
-            <w:tcW w:type="dxa" w:w="2200"/>
+            <w:tcW w:type="dxa" w:w="2400"/>
             <w:tcBorders>
               <w:top w:val="single" w:color="888888" w:sz="1"/>
               <w:left w:val="single" w:color="888888" w:sz="1"/>
@@ -3918,7 +4019,7 @@
                 <w:sz w:val="17"/>
                 <w:szCs w:val="17"/>
               </w:rPr>
-              <w:t xml:space="preserve">—</w:t>
+              <w:t xml:space="preserve">0.230</w:t>
             </w:r>
           </w:p>
         </w:tc>
@@ -3926,7 +4027,7 @@
       <w:tr>
         <w:tc>
           <w:tcPr>
-            <w:tcW w:type="dxa" w:w="2200"/>
+            <w:tcW w:type="dxa" w:w="2400"/>
             <w:tcBorders>
               <w:top w:val="single" w:color="888888" w:sz="1"/>
               <w:left w:val="single" w:color="888888" w:sz="1"/>
@@ -3951,7 +4052,7 @@
                 <w:sz w:val="17"/>
                 <w:szCs w:val="17"/>
               </w:rPr>
-              <w:t xml:space="preserve">提案手法</w:t>
+              <w:t xml:space="preserve">TAPS SE（4 kHz以上を除去）</w:t>
             </w:r>
           </w:p>
         </w:tc>
@@ -3982,7 +4083,7 @@
                 <w:sz w:val="17"/>
                 <w:szCs w:val="17"/>
               </w:rPr>
-              <w:t xml:space="preserve">—</w:t>
+              <w:t xml:space="preserve">0.221</w:t>
             </w:r>
           </w:p>
         </w:tc>
@@ -3990,7 +4091,7 @@
       <w:tr>
         <w:tc>
           <w:tcPr>
-            <w:tcW w:type="dxa" w:w="2200"/>
+            <w:tcW w:type="dxa" w:w="2400"/>
             <w:tcBorders>
               <w:top w:val="single" w:color="888888" w:sz="1"/>
               <w:left w:val="single" w:color="888888" w:sz="1"/>
@@ -4015,7 +4116,7 @@
                 <w:sz w:val="17"/>
                 <w:szCs w:val="17"/>
               </w:rPr>
-              <w:t xml:space="preserve">提案手法＋櫛ノッチ</w:t>
+              <w:t xml:space="preserve">提案手法</w:t>
             </w:r>
           </w:p>
         </w:tc>
@@ -4046,7 +4147,7 @@
                 <w:sz w:val="17"/>
                 <w:szCs w:val="17"/>
               </w:rPr>
-              <w:t xml:space="preserve">—</w:t>
+              <w:t xml:space="preserve">0.196</w:t>
             </w:r>
           </w:p>
         </w:tc>
@@ -4054,7 +4155,7 @@
       <w:tr>
         <w:tc>
           <w:tcPr>
-            <w:tcW w:type="dxa" w:w="2200"/>
+            <w:tcW w:type="dxa" w:w="2400"/>
             <w:tcBorders>
               <w:top w:val="single" w:color="888888" w:sz="1"/>
               <w:left w:val="single" w:color="888888" w:sz="1"/>
@@ -4079,7 +4180,7 @@
                 <w:sz w:val="17"/>
                 <w:szCs w:val="17"/>
               </w:rPr>
-              <w:t xml:space="preserve">提案低域＋TAPS高域</w:t>
+              <w:t xml:space="preserve">提案手法＋櫛ノッチ</w:t>
             </w:r>
           </w:p>
         </w:tc>
@@ -4110,7 +4211,7 @@
                 <w:sz w:val="17"/>
                 <w:szCs w:val="17"/>
               </w:rPr>
-              <w:t xml:space="preserve">—</w:t>
+              <w:t xml:space="preserve">0.204</w:t>
             </w:r>
           </w:p>
         </w:tc>
@@ -4118,7 +4219,7 @@
       <w:tr>
         <w:tc>
           <w:tcPr>
-            <w:tcW w:type="dxa" w:w="2200"/>
+            <w:tcW w:type="dxa" w:w="2400"/>
             <w:tcBorders>
               <w:top w:val="single" w:color="888888" w:sz="1"/>
               <w:left w:val="single" w:color="888888" w:sz="1"/>
@@ -4143,6 +4244,70 @@
                 <w:sz w:val="17"/>
                 <w:szCs w:val="17"/>
               </w:rPr>
+              <w:t xml:space="preserve">提案低域＋TAPS高域</w:t>
+            </w:r>
+          </w:p>
+        </w:tc>
+        <w:tc>
+          <w:tcPr>
+            <w:tcW w:type="dxa" w:w="900"/>
+            <w:tcBorders>
+              <w:top w:val="single" w:color="888888" w:sz="1"/>
+              <w:left w:val="single" w:color="888888" w:sz="1"/>
+              <w:bottom w:val="single" w:color="888888" w:sz="1"/>
+              <w:right w:val="single" w:color="888888" w:sz="1"/>
+            </w:tcBorders>
+            <w:tcMar>
+              <w:top w:type="dxa" w:w="20"/>
+              <w:left w:type="dxa" w:w="60"/>
+              <w:bottom w:type="dxa" w:w="20"/>
+              <w:right w:type="dxa" w:w="60"/>
+            </w:tcMar>
+          </w:tcPr>
+          <w:p>
+            <w:pPr>
+              <w:spacing w:after="0" w:line="240"/>
+              <w:jc w:val="center"/>
+            </w:pPr>
+            <w:r>
+              <w:rPr>
+                <w:rFonts w:ascii="MS Mincho" w:cs="MS Mincho" w:eastAsia="MS Mincho" w:hAnsi="MS Mincho"/>
+                <w:sz w:val="17"/>
+                <w:szCs w:val="17"/>
+              </w:rPr>
+              <w:t xml:space="preserve">0.201</w:t>
+            </w:r>
+          </w:p>
+        </w:tc>
+      </w:tr>
+      <w:tr>
+        <w:tc>
+          <w:tcPr>
+            <w:tcW w:type="dxa" w:w="2400"/>
+            <w:tcBorders>
+              <w:top w:val="single" w:color="888888" w:sz="1"/>
+              <w:left w:val="single" w:color="888888" w:sz="1"/>
+              <w:bottom w:val="single" w:color="888888" w:sz="1"/>
+              <w:right w:val="single" w:color="888888" w:sz="1"/>
+            </w:tcBorders>
+            <w:tcMar>
+              <w:top w:type="dxa" w:w="20"/>
+              <w:left w:type="dxa" w:w="60"/>
+              <w:bottom w:type="dxa" w:w="20"/>
+              <w:right w:type="dxa" w:w="60"/>
+            </w:tcMar>
+          </w:tcPr>
+          <w:p>
+            <w:pPr>
+              <w:spacing w:after="0" w:line="240"/>
+              <w:jc w:val="left"/>
+            </w:pPr>
+            <w:r>
+              <w:rPr>
+                <w:rFonts w:ascii="MS Mincho" w:cs="MS Mincho" w:eastAsia="MS Mincho" w:hAnsi="MS Mincho"/>
+                <w:sz w:val="17"/>
+                <w:szCs w:val="17"/>
+              </w:rPr>
               <w:t xml:space="preserve">TAPS低域＋提案高域</w:t>
             </w:r>
           </w:p>
@@ -4174,7 +4339,7 @@
                 <w:sz w:val="17"/>
                 <w:szCs w:val="17"/>
               </w:rPr>
-              <w:t xml:space="preserve">—</w:t>
+              <w:t xml:space="preserve">0.217</w:t>
             </w:r>
           </w:p>
         </w:tc>
@@ -4193,7 +4358,7 @@
           <w:sz w:val="17"/>
           <w:szCs w:val="17"/>
         </w:rPr>
-        <w:t xml:space="preserve">表3: 帯域入れ替え・ノッチの効果（Whisper-small、正規化後）【62待ち】</w:t>
+        <w:t xml:space="preserve">表3: 帯域入れ替え・ノッチの効果（Whisper-small、正規化後）</w:t>
       </w:r>
     </w:p>
     <w:p>
@@ -4206,7 +4371,7 @@
           <w:sz w:val="20"/>
           <w:szCs w:val="20"/>
         </w:rPr>
-        <w:t xml:space="preserve">なお提案手法はTAPS SEに比べSTOI（0.892→0.792）・PESQ（1.975→1.215）がともに低く、気導音声とのWhisper encoder出力の距離も大きい（0.200→0.326）。提案手法は気導音声に近づくのではなく、Whisperにとって認識しやすい別の信号を作っている。Iwamotoら[7]は気導マイク音声においてASRの学習がSEのartifact errorを減らすことを報告しているが、本研究ではCE損失によって気導音声に存在しない成分が増えた。</w:t>
+        <w:t xml:space="preserve">なお提案手法はTAPS SEに比べSTOI（0.892→0.792）・PESQ（1.975→1.215）がともに低く、気導音声とのWhisper encoder出力の距離も大きい（0.200→0.326）。提案手法は気導音声に近づくのではなく、Whisperにとって認識しやすい別の信号を作っている。Iwamotoら[7]は気導マイク音声においてASRの学習がSEのartifact errorを減らすことを報告しているが、本研究ではCE損失によって気導音声に存在しない成分が増え、その一部はCERの改善にも寄与していた。</w:t>
       </w:r>
     </w:p>
     <w:p>
@@ -4235,7 +4400,7 @@
           <w:sz w:val="20"/>
           <w:szCs w:val="20"/>
         </w:rPr>
-        <w:t xml:space="preserve">以上の結果は、CE損失で学習したSEが、学習に用いた認識器に向けて入力を調整する「波形領域のアダプタ」として働くことを示唆する。その効果はWhisper系列内には持ち越されるが、系列外の認識器では失われ、むしろ悪化する。一方、気導音声の表現に近づけるEnc L1は認識器を選ばない代わりに改善も小さい。ASR損失によるSEの学習には、対象の認識器への特化と汎用性のトレードオフが存在する。自己教師あり表現空間の距離を損失として学習したSEが複数の下流タスクで有効であるという報告[8]と合わせると、汎化の範囲は損失の種類に依存すると考えられる。</w:t>
+        <w:t xml:space="preserve">以上の結果は、CE損失で学習したSEが、学習に用いた認識器に向けて入力を調整する「波形領域のアダプタ」として働くことを示唆する。その効果はWhisper系列内の大きいモデルには持ち越されるが、系列外の認識器では失われ、むしろ悪化する。一方、気導音声の表現に近づけるEnc L1は認識器を選ばない代わりに改善も小さい。ASR損失によるSEの学習には、対象の認識器への特化と汎用性のトレードオフが存在する。自己教師あり表現空間の距離を損失として学習したSEが複数の下流タスクで有効であるという報告[8]と合わせると、汎化の範囲は損失の種類に依存すると考えられる。</w:t>
       </w:r>
     </w:p>
     <w:p>
@@ -4308,7 +4473,7 @@
           <w:sz w:val="20"/>
           <w:szCs w:val="20"/>
         </w:rPr>
-        <w:t xml:space="preserve">凍結したWhisperのCE損失で喉マイク用SEを学習し、その効果と汎化範囲を検証した。学習に用いたWhisperでは正規化後もCERが改善したが、改善はWhisper系列内に限られ、CTC系の認識器では悪化した。今後は複数系列の認識器の損失を組み合わせ、学習に用いていない認識器で評価する枠組みにより、認識器に依存しないASR指向のSEを検討する。</w:t>
+        <w:t xml:space="preserve">凍結したWhisperのCE損失で喉マイク用SEを学習し、その効果と汎化範囲を検証した。学習に用いたWhisper-smallでは正規化後もCERが15.0%低下したが、改善はWhisper系列内に限られ、CTC系のXLS-Rでは悪化した。また未正規化の改善幅の34%は句読点出力の抑制によるものであった。今後は複数系列の認識器の損失を組み合わせ、学習に用いていない認識器で評価する枠組みにより、認識器に依存しないASR指向のSEを検討する。</w:t>
       </w:r>
     </w:p>
     <w:p>

</xml_diff>

<commit_message>
Thesis v3: keep tables together with their captions
Co-Authored-By: Claude Opus 5.5 (1M context) <noreply@anthropic.com>
</commit_message>
<xml_diff>
--- a/results/thesis_v3.docx
+++ b/results/thesis_v3.docx
@@ -895,6 +895,8 @@
           </w:tcPr>
           <w:p>
             <w:pPr>
+              <w:keepNext/>
+              <w:keepLines/>
               <w:spacing w:after="0" w:line="240"/>
               <w:jc w:val="center"/>
             </w:pPr>
@@ -929,6 +931,8 @@
           </w:tcPr>
           <w:p>
             <w:pPr>
+              <w:keepNext/>
+              <w:keepLines/>
               <w:spacing w:after="0" w:line="240"/>
               <w:jc w:val="center"/>
             </w:pPr>
@@ -963,6 +967,8 @@
           </w:tcPr>
           <w:p>
             <w:pPr>
+              <w:keepNext/>
+              <w:keepLines/>
               <w:spacing w:after="0" w:line="240"/>
               <w:jc w:val="center"/>
             </w:pPr>
@@ -997,6 +1003,8 @@
           </w:tcPr>
           <w:p>
             <w:pPr>
+              <w:keepNext/>
+              <w:keepLines/>
               <w:spacing w:after="0" w:line="240"/>
               <w:jc w:val="center"/>
             </w:pPr>
@@ -1031,6 +1039,8 @@
           </w:tcPr>
           <w:p>
             <w:pPr>
+              <w:keepNext/>
+              <w:keepLines/>
               <w:spacing w:after="0" w:line="240"/>
               <w:jc w:val="center"/>
             </w:pPr>
@@ -1066,6 +1076,8 @@
           </w:tcPr>
           <w:p>
             <w:pPr>
+              <w:keepNext/>
+              <w:keepLines/>
               <w:spacing w:after="0" w:line="240"/>
               <w:jc w:val="left"/>
             </w:pPr>
@@ -1097,6 +1109,8 @@
           </w:tcPr>
           <w:p>
             <w:pPr>
+              <w:keepNext/>
+              <w:keepLines/>
               <w:spacing w:after="0" w:line="240"/>
               <w:jc w:val="center"/>
             </w:pPr>
@@ -1128,6 +1142,8 @@
           </w:tcPr>
           <w:p>
             <w:pPr>
+              <w:keepNext/>
+              <w:keepLines/>
               <w:spacing w:after="0" w:line="240"/>
               <w:jc w:val="center"/>
             </w:pPr>
@@ -1159,6 +1175,8 @@
           </w:tcPr>
           <w:p>
             <w:pPr>
+              <w:keepNext/>
+              <w:keepLines/>
               <w:spacing w:after="0" w:line="240"/>
               <w:jc w:val="center"/>
             </w:pPr>
@@ -1190,6 +1208,8 @@
           </w:tcPr>
           <w:p>
             <w:pPr>
+              <w:keepNext/>
+              <w:keepLines/>
               <w:spacing w:after="0" w:line="240"/>
               <w:jc w:val="center"/>
             </w:pPr>
@@ -1223,6 +1243,8 @@
           </w:tcPr>
           <w:p>
             <w:pPr>
+              <w:keepNext/>
+              <w:keepLines/>
               <w:spacing w:after="0" w:line="240"/>
               <w:jc w:val="left"/>
             </w:pPr>
@@ -1254,6 +1276,8 @@
           </w:tcPr>
           <w:p>
             <w:pPr>
+              <w:keepNext/>
+              <w:keepLines/>
               <w:spacing w:after="0" w:line="240"/>
               <w:jc w:val="center"/>
             </w:pPr>
@@ -1285,6 +1309,8 @@
           </w:tcPr>
           <w:p>
             <w:pPr>
+              <w:keepNext/>
+              <w:keepLines/>
               <w:spacing w:after="0" w:line="240"/>
               <w:jc w:val="center"/>
             </w:pPr>
@@ -1316,6 +1342,8 @@
           </w:tcPr>
           <w:p>
             <w:pPr>
+              <w:keepNext/>
+              <w:keepLines/>
               <w:spacing w:after="0" w:line="240"/>
               <w:jc w:val="center"/>
             </w:pPr>
@@ -1347,6 +1375,8 @@
           </w:tcPr>
           <w:p>
             <w:pPr>
+              <w:keepNext/>
+              <w:keepLines/>
               <w:spacing w:after="0" w:line="240"/>
               <w:jc w:val="center"/>
             </w:pPr>
@@ -1380,6 +1410,8 @@
           </w:tcPr>
           <w:p>
             <w:pPr>
+              <w:keepNext/>
+              <w:keepLines/>
               <w:spacing w:after="0" w:line="240"/>
               <w:jc w:val="left"/>
             </w:pPr>
@@ -1411,6 +1443,8 @@
           </w:tcPr>
           <w:p>
             <w:pPr>
+              <w:keepNext/>
+              <w:keepLines/>
               <w:spacing w:after="0" w:line="240"/>
               <w:jc w:val="center"/>
             </w:pPr>
@@ -1442,6 +1476,8 @@
           </w:tcPr>
           <w:p>
             <w:pPr>
+              <w:keepNext/>
+              <w:keepLines/>
               <w:spacing w:after="0" w:line="240"/>
               <w:jc w:val="center"/>
             </w:pPr>
@@ -1473,6 +1509,8 @@
           </w:tcPr>
           <w:p>
             <w:pPr>
+              <w:keepNext/>
+              <w:keepLines/>
               <w:spacing w:after="0" w:line="240"/>
               <w:jc w:val="center"/>
             </w:pPr>
@@ -1504,6 +1542,8 @@
           </w:tcPr>
           <w:p>
             <w:pPr>
+              <w:keepNext/>
+              <w:keepLines/>
               <w:spacing w:after="0" w:line="240"/>
               <w:jc w:val="center"/>
             </w:pPr>
@@ -1537,6 +1577,8 @@
           </w:tcPr>
           <w:p>
             <w:pPr>
+              <w:keepNext/>
+              <w:keepLines/>
               <w:spacing w:after="0" w:line="240"/>
               <w:jc w:val="left"/>
             </w:pPr>
@@ -1568,6 +1610,8 @@
           </w:tcPr>
           <w:p>
             <w:pPr>
+              <w:keepNext/>
+              <w:keepLines/>
               <w:spacing w:after="0" w:line="240"/>
               <w:jc w:val="center"/>
             </w:pPr>
@@ -1599,6 +1643,8 @@
           </w:tcPr>
           <w:p>
             <w:pPr>
+              <w:keepNext/>
+              <w:keepLines/>
               <w:spacing w:after="0" w:line="240"/>
               <w:jc w:val="center"/>
             </w:pPr>
@@ -1630,6 +1676,8 @@
           </w:tcPr>
           <w:p>
             <w:pPr>
+              <w:keepNext/>
+              <w:keepLines/>
               <w:spacing w:after="0" w:line="240"/>
               <w:jc w:val="center"/>
             </w:pPr>
@@ -1661,6 +1709,8 @@
           </w:tcPr>
           <w:p>
             <w:pPr>
+              <w:keepNext/>
+              <w:keepLines/>
               <w:spacing w:after="0" w:line="240"/>
               <w:jc w:val="center"/>
             </w:pPr>
@@ -1694,6 +1744,8 @@
           </w:tcPr>
           <w:p>
             <w:pPr>
+              <w:keepNext/>
+              <w:keepLines/>
               <w:spacing w:after="0" w:line="240"/>
               <w:jc w:val="left"/>
             </w:pPr>
@@ -1725,6 +1777,8 @@
           </w:tcPr>
           <w:p>
             <w:pPr>
+              <w:keepNext/>
+              <w:keepLines/>
               <w:spacing w:after="0" w:line="240"/>
               <w:jc w:val="center"/>
             </w:pPr>
@@ -1756,6 +1810,8 @@
           </w:tcPr>
           <w:p>
             <w:pPr>
+              <w:keepNext/>
+              <w:keepLines/>
               <w:spacing w:after="0" w:line="240"/>
               <w:jc w:val="center"/>
             </w:pPr>
@@ -1787,6 +1843,8 @@
           </w:tcPr>
           <w:p>
             <w:pPr>
+              <w:keepNext/>
+              <w:keepLines/>
               <w:spacing w:after="0" w:line="240"/>
               <w:jc w:val="center"/>
             </w:pPr>
@@ -1818,6 +1876,8 @@
           </w:tcPr>
           <w:p>
             <w:pPr>
+              <w:keepNext/>
+              <w:keepLines/>
               <w:spacing w:after="0" w:line="240"/>
               <w:jc w:val="center"/>
             </w:pPr>
@@ -1851,6 +1911,8 @@
           </w:tcPr>
           <w:p>
             <w:pPr>
+              <w:keepNext/>
+              <w:keepLines/>
               <w:spacing w:after="0" w:line="240"/>
               <w:jc w:val="left"/>
             </w:pPr>
@@ -1882,6 +1944,8 @@
           </w:tcPr>
           <w:p>
             <w:pPr>
+              <w:keepNext/>
+              <w:keepLines/>
               <w:spacing w:after="0" w:line="240"/>
               <w:jc w:val="center"/>
             </w:pPr>
@@ -1913,6 +1977,8 @@
           </w:tcPr>
           <w:p>
             <w:pPr>
+              <w:keepNext/>
+              <w:keepLines/>
               <w:spacing w:after="0" w:line="240"/>
               <w:jc w:val="center"/>
             </w:pPr>
@@ -1944,6 +2010,8 @@
           </w:tcPr>
           <w:p>
             <w:pPr>
+              <w:keepNext/>
+              <w:keepLines/>
               <w:spacing w:after="0" w:line="240"/>
               <w:jc w:val="center"/>
             </w:pPr>
@@ -1975,6 +2043,8 @@
           </w:tcPr>
           <w:p>
             <w:pPr>
+              <w:keepNext/>
+              <w:keepLines/>
               <w:spacing w:after="0" w:line="240"/>
               <w:jc w:val="center"/>
             </w:pPr>
@@ -2008,6 +2078,8 @@
           </w:tcPr>
           <w:p>
             <w:pPr>
+              <w:keepNext/>
+              <w:keepLines/>
               <w:spacing w:after="0" w:line="240"/>
               <w:jc w:val="left"/>
             </w:pPr>
@@ -2039,6 +2111,8 @@
           </w:tcPr>
           <w:p>
             <w:pPr>
+              <w:keepNext/>
+              <w:keepLines/>
               <w:spacing w:after="0" w:line="240"/>
               <w:jc w:val="center"/>
             </w:pPr>
@@ -2070,6 +2144,8 @@
           </w:tcPr>
           <w:p>
             <w:pPr>
+              <w:keepNext/>
+              <w:keepLines/>
               <w:spacing w:after="0" w:line="240"/>
               <w:jc w:val="center"/>
             </w:pPr>
@@ -2101,6 +2177,8 @@
           </w:tcPr>
           <w:p>
             <w:pPr>
+              <w:keepNext/>
+              <w:keepLines/>
               <w:spacing w:after="0" w:line="240"/>
               <w:jc w:val="center"/>
             </w:pPr>
@@ -2132,6 +2210,8 @@
           </w:tcPr>
           <w:p>
             <w:pPr>
+              <w:keepNext/>
+              <w:keepLines/>
               <w:spacing w:after="0" w:line="240"/>
               <w:jc w:val="center"/>
             </w:pPr>
@@ -2149,6 +2229,7 @@
     </w:tbl>
     <w:p>
       <w:pPr>
+        <w:keepLines/>
         <w:spacing w:after="140" w:before="30"/>
         <w:jc w:val="center"/>
       </w:pPr>
@@ -2367,6 +2448,8 @@
           </w:tcPr>
           <w:p>
             <w:pPr>
+              <w:keepNext/>
+              <w:keepLines/>
               <w:spacing w:after="0" w:line="240"/>
               <w:jc w:val="center"/>
             </w:pPr>
@@ -2401,6 +2484,8 @@
           </w:tcPr>
           <w:p>
             <w:pPr>
+              <w:keepNext/>
+              <w:keepLines/>
               <w:spacing w:after="0" w:line="240"/>
               <w:jc w:val="center"/>
             </w:pPr>
@@ -2435,6 +2520,8 @@
           </w:tcPr>
           <w:p>
             <w:pPr>
+              <w:keepNext/>
+              <w:keepLines/>
               <w:spacing w:after="0" w:line="240"/>
               <w:jc w:val="center"/>
             </w:pPr>
@@ -2469,6 +2556,8 @@
           </w:tcPr>
           <w:p>
             <w:pPr>
+              <w:keepNext/>
+              <w:keepLines/>
               <w:spacing w:after="0" w:line="240"/>
               <w:jc w:val="center"/>
             </w:pPr>
@@ -2503,6 +2592,8 @@
           </w:tcPr>
           <w:p>
             <w:pPr>
+              <w:keepNext/>
+              <w:keepLines/>
               <w:spacing w:after="0" w:line="240"/>
               <w:jc w:val="center"/>
             </w:pPr>
@@ -2537,6 +2628,8 @@
           </w:tcPr>
           <w:p>
             <w:pPr>
+              <w:keepNext/>
+              <w:keepLines/>
               <w:spacing w:after="0" w:line="240"/>
               <w:jc w:val="center"/>
             </w:pPr>
@@ -2571,6 +2664,8 @@
           </w:tcPr>
           <w:p>
             <w:pPr>
+              <w:keepNext/>
+              <w:keepLines/>
               <w:spacing w:after="0" w:line="240"/>
               <w:jc w:val="center"/>
             </w:pPr>
@@ -2606,6 +2701,8 @@
           </w:tcPr>
           <w:p>
             <w:pPr>
+              <w:keepNext/>
+              <w:keepLines/>
               <w:spacing w:after="0" w:line="240"/>
               <w:jc w:val="left"/>
             </w:pPr>
@@ -2637,6 +2734,8 @@
           </w:tcPr>
           <w:p>
             <w:pPr>
+              <w:keepNext/>
+              <w:keepLines/>
               <w:spacing w:after="0" w:line="240"/>
               <w:jc w:val="center"/>
             </w:pPr>
@@ -2668,6 +2767,8 @@
           </w:tcPr>
           <w:p>
             <w:pPr>
+              <w:keepNext/>
+              <w:keepLines/>
               <w:spacing w:after="0" w:line="240"/>
               <w:jc w:val="center"/>
             </w:pPr>
@@ -2699,6 +2800,8 @@
           </w:tcPr>
           <w:p>
             <w:pPr>
+              <w:keepNext/>
+              <w:keepLines/>
               <w:spacing w:after="0" w:line="240"/>
               <w:jc w:val="center"/>
             </w:pPr>
@@ -2730,6 +2833,8 @@
           </w:tcPr>
           <w:p>
             <w:pPr>
+              <w:keepNext/>
+              <w:keepLines/>
               <w:spacing w:after="0" w:line="240"/>
               <w:jc w:val="center"/>
             </w:pPr>
@@ -2761,6 +2866,8 @@
           </w:tcPr>
           <w:p>
             <w:pPr>
+              <w:keepNext/>
+              <w:keepLines/>
               <w:spacing w:after="0" w:line="240"/>
               <w:jc w:val="center"/>
             </w:pPr>
@@ -2792,6 +2899,8 @@
           </w:tcPr>
           <w:p>
             <w:pPr>
+              <w:keepNext/>
+              <w:keepLines/>
               <w:spacing w:after="0" w:line="240"/>
               <w:jc w:val="center"/>
             </w:pPr>
@@ -2825,6 +2934,8 @@
           </w:tcPr>
           <w:p>
             <w:pPr>
+              <w:keepNext/>
+              <w:keepLines/>
               <w:spacing w:after="0" w:line="240"/>
               <w:jc w:val="left"/>
             </w:pPr>
@@ -2856,6 +2967,8 @@
           </w:tcPr>
           <w:p>
             <w:pPr>
+              <w:keepNext/>
+              <w:keepLines/>
               <w:spacing w:after="0" w:line="240"/>
               <w:jc w:val="center"/>
             </w:pPr>
@@ -2887,6 +3000,8 @@
           </w:tcPr>
           <w:p>
             <w:pPr>
+              <w:keepNext/>
+              <w:keepLines/>
               <w:spacing w:after="0" w:line="240"/>
               <w:jc w:val="center"/>
             </w:pPr>
@@ -2918,6 +3033,8 @@
           </w:tcPr>
           <w:p>
             <w:pPr>
+              <w:keepNext/>
+              <w:keepLines/>
               <w:spacing w:after="0" w:line="240"/>
               <w:jc w:val="center"/>
             </w:pPr>
@@ -2949,6 +3066,8 @@
           </w:tcPr>
           <w:p>
             <w:pPr>
+              <w:keepNext/>
+              <w:keepLines/>
               <w:spacing w:after="0" w:line="240"/>
               <w:jc w:val="center"/>
             </w:pPr>
@@ -2980,6 +3099,8 @@
           </w:tcPr>
           <w:p>
             <w:pPr>
+              <w:keepNext/>
+              <w:keepLines/>
               <w:spacing w:after="0" w:line="240"/>
               <w:jc w:val="center"/>
             </w:pPr>
@@ -3011,6 +3132,8 @@
           </w:tcPr>
           <w:p>
             <w:pPr>
+              <w:keepNext/>
+              <w:keepLines/>
               <w:spacing w:after="0" w:line="240"/>
               <w:jc w:val="center"/>
             </w:pPr>
@@ -3044,6 +3167,8 @@
           </w:tcPr>
           <w:p>
             <w:pPr>
+              <w:keepNext/>
+              <w:keepLines/>
               <w:spacing w:after="0" w:line="240"/>
               <w:jc w:val="left"/>
             </w:pPr>
@@ -3075,6 +3200,8 @@
           </w:tcPr>
           <w:p>
             <w:pPr>
+              <w:keepNext/>
+              <w:keepLines/>
               <w:spacing w:after="0" w:line="240"/>
               <w:jc w:val="center"/>
             </w:pPr>
@@ -3106,6 +3233,8 @@
           </w:tcPr>
           <w:p>
             <w:pPr>
+              <w:keepNext/>
+              <w:keepLines/>
               <w:spacing w:after="0" w:line="240"/>
               <w:jc w:val="center"/>
             </w:pPr>
@@ -3137,6 +3266,8 @@
           </w:tcPr>
           <w:p>
             <w:pPr>
+              <w:keepNext/>
+              <w:keepLines/>
               <w:spacing w:after="0" w:line="240"/>
               <w:jc w:val="center"/>
             </w:pPr>
@@ -3168,6 +3299,8 @@
           </w:tcPr>
           <w:p>
             <w:pPr>
+              <w:keepNext/>
+              <w:keepLines/>
               <w:spacing w:after="0" w:line="240"/>
               <w:jc w:val="center"/>
             </w:pPr>
@@ -3199,6 +3332,8 @@
           </w:tcPr>
           <w:p>
             <w:pPr>
+              <w:keepNext/>
+              <w:keepLines/>
               <w:spacing w:after="0" w:line="240"/>
               <w:jc w:val="center"/>
             </w:pPr>
@@ -3230,6 +3365,8 @@
           </w:tcPr>
           <w:p>
             <w:pPr>
+              <w:keepNext/>
+              <w:keepLines/>
               <w:spacing w:after="0" w:line="240"/>
               <w:jc w:val="center"/>
             </w:pPr>
@@ -3263,6 +3400,8 @@
           </w:tcPr>
           <w:p>
             <w:pPr>
+              <w:keepNext/>
+              <w:keepLines/>
               <w:spacing w:after="0" w:line="240"/>
               <w:jc w:val="left"/>
             </w:pPr>
@@ -3294,6 +3433,8 @@
           </w:tcPr>
           <w:p>
             <w:pPr>
+              <w:keepNext/>
+              <w:keepLines/>
               <w:spacing w:after="0" w:line="240"/>
               <w:jc w:val="center"/>
             </w:pPr>
@@ -3325,6 +3466,8 @@
           </w:tcPr>
           <w:p>
             <w:pPr>
+              <w:keepNext/>
+              <w:keepLines/>
               <w:spacing w:after="0" w:line="240"/>
               <w:jc w:val="center"/>
             </w:pPr>
@@ -3356,6 +3499,8 @@
           </w:tcPr>
           <w:p>
             <w:pPr>
+              <w:keepNext/>
+              <w:keepLines/>
               <w:spacing w:after="0" w:line="240"/>
               <w:jc w:val="center"/>
             </w:pPr>
@@ -3387,6 +3532,8 @@
           </w:tcPr>
           <w:p>
             <w:pPr>
+              <w:keepNext/>
+              <w:keepLines/>
               <w:spacing w:after="0" w:line="240"/>
               <w:jc w:val="center"/>
             </w:pPr>
@@ -3418,6 +3565,8 @@
           </w:tcPr>
           <w:p>
             <w:pPr>
+              <w:keepNext/>
+              <w:keepLines/>
               <w:spacing w:after="0" w:line="240"/>
               <w:jc w:val="center"/>
             </w:pPr>
@@ -3449,6 +3598,8 @@
           </w:tcPr>
           <w:p>
             <w:pPr>
+              <w:keepNext/>
+              <w:keepLines/>
               <w:spacing w:after="0" w:line="240"/>
               <w:jc w:val="center"/>
             </w:pPr>
@@ -3482,6 +3633,8 @@
           </w:tcPr>
           <w:p>
             <w:pPr>
+              <w:keepNext/>
+              <w:keepLines/>
               <w:spacing w:after="0" w:line="240"/>
               <w:jc w:val="left"/>
             </w:pPr>
@@ -3513,6 +3666,8 @@
           </w:tcPr>
           <w:p>
             <w:pPr>
+              <w:keepNext/>
+              <w:keepLines/>
               <w:spacing w:after="0" w:line="240"/>
               <w:jc w:val="center"/>
             </w:pPr>
@@ -3544,6 +3699,8 @@
           </w:tcPr>
           <w:p>
             <w:pPr>
+              <w:keepNext/>
+              <w:keepLines/>
               <w:spacing w:after="0" w:line="240"/>
               <w:jc w:val="center"/>
             </w:pPr>
@@ -3575,6 +3732,8 @@
           </w:tcPr>
           <w:p>
             <w:pPr>
+              <w:keepNext/>
+              <w:keepLines/>
               <w:spacing w:after="0" w:line="240"/>
               <w:jc w:val="center"/>
             </w:pPr>
@@ -3606,6 +3765,8 @@
           </w:tcPr>
           <w:p>
             <w:pPr>
+              <w:keepNext/>
+              <w:keepLines/>
               <w:spacing w:after="0" w:line="240"/>
               <w:jc w:val="center"/>
             </w:pPr>
@@ -3637,6 +3798,8 @@
           </w:tcPr>
           <w:p>
             <w:pPr>
+              <w:keepNext/>
+              <w:keepLines/>
               <w:spacing w:after="0" w:line="240"/>
               <w:jc w:val="center"/>
             </w:pPr>
@@ -3668,6 +3831,8 @@
           </w:tcPr>
           <w:p>
             <w:pPr>
+              <w:keepNext/>
+              <w:keepLines/>
               <w:spacing w:after="0" w:line="240"/>
               <w:jc w:val="center"/>
             </w:pPr>
@@ -3685,6 +3850,7 @@
     </w:tbl>
     <w:p>
       <w:pPr>
+        <w:keepLines/>
         <w:spacing w:after="140" w:before="30"/>
         <w:jc w:val="center"/>
       </w:pPr>
@@ -3847,6 +4013,7 @@
     </w:p>
     <w:p>
       <w:pPr>
+        <w:keepLines/>
         <w:spacing w:after="140" w:before="30"/>
         <w:jc w:val="center"/>
       </w:pPr>
@@ -3910,6 +4077,8 @@
           </w:tcPr>
           <w:p>
             <w:pPr>
+              <w:keepNext/>
+              <w:keepLines/>
               <w:spacing w:after="0" w:line="240"/>
               <w:jc w:val="center"/>
             </w:pPr>
@@ -3944,6 +4113,8 @@
           </w:tcPr>
           <w:p>
             <w:pPr>
+              <w:keepNext/>
+              <w:keepLines/>
               <w:spacing w:after="0" w:line="240"/>
               <w:jc w:val="center"/>
             </w:pPr>
@@ -3979,6 +4150,8 @@
           </w:tcPr>
           <w:p>
             <w:pPr>
+              <w:keepNext/>
+              <w:keepLines/>
               <w:spacing w:after="0" w:line="240"/>
               <w:jc w:val="left"/>
             </w:pPr>
@@ -4010,6 +4183,8 @@
           </w:tcPr>
           <w:p>
             <w:pPr>
+              <w:keepNext/>
+              <w:keepLines/>
               <w:spacing w:after="0" w:line="240"/>
               <w:jc w:val="center"/>
             </w:pPr>
@@ -4043,6 +4218,8 @@
           </w:tcPr>
           <w:p>
             <w:pPr>
+              <w:keepNext/>
+              <w:keepLines/>
               <w:spacing w:after="0" w:line="240"/>
               <w:jc w:val="left"/>
             </w:pPr>
@@ -4074,6 +4251,8 @@
           </w:tcPr>
           <w:p>
             <w:pPr>
+              <w:keepNext/>
+              <w:keepLines/>
               <w:spacing w:after="0" w:line="240"/>
               <w:jc w:val="center"/>
             </w:pPr>
@@ -4107,6 +4286,8 @@
           </w:tcPr>
           <w:p>
             <w:pPr>
+              <w:keepNext/>
+              <w:keepLines/>
               <w:spacing w:after="0" w:line="240"/>
               <w:jc w:val="left"/>
             </w:pPr>
@@ -4138,6 +4319,8 @@
           </w:tcPr>
           <w:p>
             <w:pPr>
+              <w:keepNext/>
+              <w:keepLines/>
               <w:spacing w:after="0" w:line="240"/>
               <w:jc w:val="center"/>
             </w:pPr>
@@ -4171,6 +4354,8 @@
           </w:tcPr>
           <w:p>
             <w:pPr>
+              <w:keepNext/>
+              <w:keepLines/>
               <w:spacing w:after="0" w:line="240"/>
               <w:jc w:val="left"/>
             </w:pPr>
@@ -4202,6 +4387,8 @@
           </w:tcPr>
           <w:p>
             <w:pPr>
+              <w:keepNext/>
+              <w:keepLines/>
               <w:spacing w:after="0" w:line="240"/>
               <w:jc w:val="center"/>
             </w:pPr>
@@ -4235,6 +4422,8 @@
           </w:tcPr>
           <w:p>
             <w:pPr>
+              <w:keepNext/>
+              <w:keepLines/>
               <w:spacing w:after="0" w:line="240"/>
               <w:jc w:val="left"/>
             </w:pPr>
@@ -4266,6 +4455,8 @@
           </w:tcPr>
           <w:p>
             <w:pPr>
+              <w:keepNext/>
+              <w:keepLines/>
               <w:spacing w:after="0" w:line="240"/>
               <w:jc w:val="center"/>
             </w:pPr>
@@ -4299,6 +4490,8 @@
           </w:tcPr>
           <w:p>
             <w:pPr>
+              <w:keepNext/>
+              <w:keepLines/>
               <w:spacing w:after="0" w:line="240"/>
               <w:jc w:val="left"/>
             </w:pPr>
@@ -4330,6 +4523,8 @@
           </w:tcPr>
           <w:p>
             <w:pPr>
+              <w:keepNext/>
+              <w:keepLines/>
               <w:spacing w:after="0" w:line="240"/>
               <w:jc w:val="center"/>
             </w:pPr>
@@ -4347,6 +4542,7 @@
     </w:tbl>
     <w:p>
       <w:pPr>
+        <w:keepLines/>
         <w:spacing w:after="140" w:before="30"/>
         <w:jc w:val="center"/>
       </w:pPr>

</xml_diff>